<commit_message>
Agregar README y documentos del portafolio
</commit_message>
<xml_diff>
--- a/DESIGN.docx
+++ b/DESIGN.docx
@@ -32,6 +32,17 @@
       </w:r>
     </w:p>
     <w:p>
+      <w:pPr/>
+      <w:r>
+        <w:rPr>
+          <w:i/>
+          <w:color w:val="5A646E"/>
+          <w:sz w:val="18"/>
+        </w:rPr>
+        <w:t>CV digital — Sofía Ramos Ferra</w:t>
+      </w:r>
+    </w:p>
+    <w:p>
       <w:pPr>
         <w:spacing w:before="100" w:beforeAutospacing="1" w:after="100" w:afterAutospacing="1"/>
         <w:jc w:val="center"/>
@@ -324,7 +335,7 @@
           <w:lang w:val="es-MX" w:eastAsia="es-MX"/>
           <w14:ligatures w14:val="none"/>
         </w:rPr>
-        <w:t>El beige #FEFAE7 funciona como el fondo principal del CV. Busco que sea cálido y cercano, por lo que incorporo una textura de papel sutil pero visible. Esta textura aporta materialidad al sistema y hace que la pantalla tenga una sensación menos fría, pero sin llevar la identidad hacia una estética vintage.</w:t>
+        <w:t>El beige #F9F7EF funciona como el fondo principal del sistema. Busco que sea cálido y cercano, por lo que incorporo una textura de papel sutil pero visible. Esta textura aporta materialidad a la pantalla y hace que la experiencia se sienta menos fría, sin llevar la identidad hacia una estética vintage.</w:t>
       </w:r>
     </w:p>
     <w:p>
@@ -727,73 +738,73 @@
           <w:lang w:val="es-MX" w:eastAsia="es-MX"/>
           <w14:ligatures w14:val="none"/>
         </w:rPr>
-        <w:t>Utilizo Handsome Pro para los títulos principales. Su apariencia manuscrita establece una relación directa con el lettering de mi logotipo y hace que los encabezados tengan una personalidad reconocible.</w:t>
-      </w:r>
-    </w:p>
-    <w:p>
-      <w:pPr>
-        <w:spacing w:before="100" w:beforeAutospacing="1" w:after="100" w:afterAutospacing="1"/>
-        <w:rPr>
-          <w:rFonts w:ascii="Arial" w:eastAsia="Times New Roman" w:hAnsi="Arial" w:cs="Arial"/>
-          <w:color w:val="091C85"/>
-          <w:kern w:val="0"/>
-          <w:lang w:val="es-MX" w:eastAsia="es-MX"/>
-          <w14:ligatures w14:val="none"/>
-        </w:rPr>
-      </w:pPr>
-      <w:r>
-        <w:rPr>
-          <w:rFonts w:ascii="Arial" w:eastAsia="Times New Roman" w:hAnsi="Arial" w:cs="Arial"/>
-          <w:color w:val="091C85"/>
-          <w:kern w:val="0"/>
-          <w:lang w:val="es-MX" w:eastAsia="es-MX"/>
-          <w14:ligatures w14:val="none"/>
-        </w:rPr>
-        <w:t>Sin embargo, Handsome Pro se utiliza de manera puntual. No aparece en textos largos ni en toda la interfaz, sino únicamente en títulos importantes como las grandes secciones del CV. De esta manera, conserva su impacto y no afecta la legibilidad.</w:t>
-      </w:r>
-    </w:p>
-    <w:p>
-      <w:pPr>
-        <w:spacing w:before="100" w:beforeAutospacing="1" w:after="100" w:afterAutospacing="1"/>
-        <w:rPr>
-          <w:rFonts w:ascii="Arial" w:eastAsia="Times New Roman" w:hAnsi="Arial" w:cs="Arial"/>
-          <w:color w:val="091C85"/>
-          <w:kern w:val="0"/>
-          <w:lang w:val="es-MX" w:eastAsia="es-MX"/>
-          <w14:ligatures w14:val="none"/>
-        </w:rPr>
-      </w:pPr>
-      <w:r>
-        <w:rPr>
-          <w:rFonts w:ascii="Arial" w:eastAsia="Times New Roman" w:hAnsi="Arial" w:cs="Arial"/>
-          <w:color w:val="091C85"/>
-          <w:kern w:val="0"/>
-          <w:lang w:val="es-MX" w:eastAsia="es-MX"/>
-          <w14:ligatures w14:val="none"/>
-        </w:rPr>
-        <w:t>Para textos y subtítulos utilizo Raleway. Su estructura limpia y contemporánea permite equilibrar la expresividad de Handsome Pro y mantener una lectura clara.</w:t>
-      </w:r>
-    </w:p>
-    <w:p>
-      <w:pPr>
-        <w:spacing w:before="100" w:beforeAutospacing="1" w:after="100" w:afterAutospacing="1"/>
-        <w:rPr>
-          <w:rFonts w:ascii="Arial" w:eastAsia="Times New Roman" w:hAnsi="Arial" w:cs="Arial"/>
-          <w:color w:val="091C85"/>
-          <w:kern w:val="0"/>
-          <w:lang w:val="es-MX" w:eastAsia="es-MX"/>
-          <w14:ligatures w14:val="none"/>
-        </w:rPr>
-      </w:pPr>
-      <w:r>
-        <w:rPr>
-          <w:rFonts w:ascii="Arial" w:eastAsia="Times New Roman" w:hAnsi="Arial" w:cs="Arial"/>
-          <w:color w:val="091C85"/>
-          <w:kern w:val="0"/>
-          <w:lang w:val="es-MX" w:eastAsia="es-MX"/>
-          <w14:ligatures w14:val="none"/>
-        </w:rPr>
-        <w:t>Raleway utiliza diferentes pesos para generar jerarquías. Los cambios de tamaño, peso y color permiten diferenciar títulos secundarios, información, categorías y pequeños énfasis sin tener que utilizar constantemente la tipografía del logotipo.</w:t>
+        <w:t>Para la tipografía display declaro Handsome Pro como primera opción y Playwrite US Trad como alternativa. Playwrite US Trad sí está cargada localmente en el HTML y se utiliza en los títulos de sección; por eso forma parte de la identidad tipográfica implementada.</w:t>
+      </w:r>
+    </w:p>
+    <w:p>
+      <w:pPr>
+        <w:spacing w:before="100" w:beforeAutospacing="1" w:after="100" w:afterAutospacing="1"/>
+        <w:rPr>
+          <w:rFonts w:ascii="Arial" w:eastAsia="Times New Roman" w:hAnsi="Arial" w:cs="Arial"/>
+          <w:color w:val="091C85"/>
+          <w:kern w:val="0"/>
+          <w:lang w:val="es-MX" w:eastAsia="es-MX"/>
+          <w14:ligatures w14:val="none"/>
+        </w:rPr>
+      </w:pPr>
+      <w:r>
+        <w:rPr>
+          <w:rFonts w:ascii="Arial" w:eastAsia="Times New Roman" w:hAnsi="Arial" w:cs="Arial"/>
+          <w:color w:val="091C85"/>
+          <w:kern w:val="0"/>
+          <w:lang w:val="es-MX" w:eastAsia="es-MX"/>
+          <w14:ligatures w14:val="none"/>
+        </w:rPr>
+        <w:t>Handsome Pro se reserva para títulos principales cuando la fuente está disponible. La pila tipográfica incluye Playwrite US Trad como alternativa de visualización, de modo que el estilo manuscrito se conserve si Handsome Pro no está instalada o no se puede cargar.</w:t>
+      </w:r>
+    </w:p>
+    <w:p>
+      <w:pPr>
+        <w:spacing w:before="100" w:beforeAutospacing="1" w:after="100" w:afterAutospacing="1"/>
+        <w:rPr>
+          <w:rFonts w:ascii="Arial" w:eastAsia="Times New Roman" w:hAnsi="Arial" w:cs="Arial"/>
+          <w:color w:val="091C85"/>
+          <w:kern w:val="0"/>
+          <w:lang w:val="es-MX" w:eastAsia="es-MX"/>
+          <w14:ligatures w14:val="none"/>
+        </w:rPr>
+      </w:pPr>
+      <w:r>
+        <w:rPr>
+          <w:rFonts w:ascii="Arial" w:eastAsia="Times New Roman" w:hAnsi="Arial" w:cs="Arial"/>
+          <w:color w:val="091C85"/>
+          <w:kern w:val="0"/>
+          <w:lang w:val="es-MX" w:eastAsia="es-MX"/>
+          <w14:ligatures w14:val="none"/>
+        </w:rPr>
+        <w:t>Para los textos de interfaz utilizo Manrope, cargada desde los archivos locales del proyecto. Su estructura limpia y contemporánea permite mantener una lectura clara y equilibrar el carácter expresivo de la tipografía display.</w:t>
+      </w:r>
+    </w:p>
+    <w:p>
+      <w:pPr>
+        <w:spacing w:before="100" w:beforeAutospacing="1" w:after="100" w:afterAutospacing="1"/>
+        <w:rPr>
+          <w:rFonts w:ascii="Arial" w:eastAsia="Times New Roman" w:hAnsi="Arial" w:cs="Arial"/>
+          <w:color w:val="091C85"/>
+          <w:kern w:val="0"/>
+          <w:lang w:val="es-MX" w:eastAsia="es-MX"/>
+          <w14:ligatures w14:val="none"/>
+        </w:rPr>
+      </w:pPr>
+      <w:r>
+        <w:rPr>
+          <w:rFonts w:ascii="Arial" w:eastAsia="Times New Roman" w:hAnsi="Arial" w:cs="Arial"/>
+          <w:color w:val="091C85"/>
+          <w:kern w:val="0"/>
+          <w:lang w:val="es-MX" w:eastAsia="es-MX"/>
+          <w14:ligatures w14:val="none"/>
+        </w:rPr>
+        <w:t>En resumen, la implementación tipográfica del index.html combina Handsome Pro como primera opción display, Playwrite US Trad como alternativa cargada localmente y Manrope para los textos funcionales de la interfaz.</w:t>
       </w:r>
     </w:p>
     <w:p>
@@ -1107,7 +1118,7 @@
           <w:lang w:val="es-MX" w:eastAsia="es-MX"/>
           <w14:ligatures w14:val="none"/>
         </w:rPr>
-        <w:t>Tengo aproximadamente 20 proyectos, organizados en cuatro categorías principales:</w:t>
+        <w:t>La página principal organiza la galería por categorías cargadas desde el archivo externo assets/portfolio-data.js. El orden principal definido en index.html es el siguiente:</w:t>
       </w:r>
     </w:p>
     <w:p>
@@ -1133,7 +1144,7 @@
           <w:lang w:val="es-MX" w:eastAsia="es-MX"/>
           <w14:ligatures w14:val="none"/>
         </w:rPr>
-        <w:t>Motion graphics</w:t>
+        <w:t>Ilustración.</w:t>
       </w:r>
     </w:p>
     <w:p>
@@ -1159,7 +1170,7 @@
           <w:lang w:val="es-MX" w:eastAsia="es-MX"/>
           <w14:ligatures w14:val="none"/>
         </w:rPr>
-        <w:t>Identidad visual / Packaging</w:t>
+        <w:t>Empaque.</w:t>
       </w:r>
     </w:p>
     <w:p>
@@ -1185,7 +1196,7 @@
           <w:lang w:val="es-MX" w:eastAsia="es-MX"/>
           <w14:ligatures w14:val="none"/>
         </w:rPr>
-        <w:t>Editorial</w:t>
+        <w:t>Animación.</w:t>
       </w:r>
     </w:p>
     <w:p>
@@ -1211,52 +1222,51 @@
           <w:lang w:val="es-MX" w:eastAsia="es-MX"/>
           <w14:ligatures w14:val="none"/>
         </w:rPr>
-        <w:t>Ilustración</w:t>
-      </w:r>
-    </w:p>
-    <w:p>
-      <w:pPr>
-        <w:spacing w:before="100" w:beforeAutospacing="1" w:after="100" w:afterAutospacing="1"/>
-        <w:rPr>
-          <w:rFonts w:ascii="Arial" w:eastAsia="Times New Roman" w:hAnsi="Arial" w:cs="Arial"/>
-          <w:color w:val="091C85"/>
-          <w:kern w:val="0"/>
-          <w:lang w:val="es-MX" w:eastAsia="es-MX"/>
-          <w14:ligatures w14:val="none"/>
-        </w:rPr>
-      </w:pPr>
-      <w:r>
-        <w:rPr>
-          <w:rFonts w:ascii="Arial" w:eastAsia="Times New Roman" w:hAnsi="Arial" w:cs="Arial"/>
-          <w:color w:val="091C85"/>
-          <w:kern w:val="0"/>
-          <w:lang w:val="es-MX" w:eastAsia="es-MX"/>
-          <w14:ligatures w14:val="none"/>
-        </w:rPr>
-        <w:t>La organización por categorías permite que el usuario pueda recorrer mi trabajo de una manera más clara y encontrar diferentes áreas de diseño.</w:t>
-      </w:r>
-    </w:p>
-    <w:p>
-      <w:pPr>
-        <w:spacing w:before="100" w:beforeAutospacing="1" w:after="100" w:afterAutospacing="1"/>
-        <w:rPr>
-          <w:rFonts w:ascii="Arial" w:eastAsia="Times New Roman" w:hAnsi="Arial" w:cs="Arial"/>
-          <w:color w:val="091C85"/>
-          <w:kern w:val="0"/>
-          <w:lang w:val="es-MX" w:eastAsia="es-MX"/>
-          <w14:ligatures w14:val="none"/>
-        </w:rPr>
-      </w:pPr>
-      <w:r>
-        <w:rPr>
-          <w:rFonts w:ascii="Arial" w:eastAsia="Times New Roman" w:hAnsi="Arial" w:cs="Arial"/>
-          <w:color w:val="091C85"/>
-          <w:kern w:val="0"/>
-          <w:lang w:val="es-MX" w:eastAsia="es-MX"/>
-          <w14:ligatures w14:val="none"/>
-        </w:rPr>
-        <w:lastRenderedPageBreak/>
-        <w:t>Dentro de cada categoría utilizo una composición editorial dinámica. Las imágenes pueden tener diferentes tamaños y posiciones, pero siempre parten de la retícula general del sistema.</w:t>
+        <w:t>Modelado 3D, Campañas y Editorial.</w:t>
+      </w:r>
+    </w:p>
+    <w:p>
+      <w:pPr>
+        <w:spacing w:before="100" w:beforeAutospacing="1" w:after="100" w:afterAutospacing="1"/>
+        <w:rPr>
+          <w:rFonts w:ascii="Arial" w:eastAsia="Times New Roman" w:hAnsi="Arial" w:cs="Arial"/>
+          <w:color w:val="091C85"/>
+          <w:kern w:val="0"/>
+          <w:lang w:val="es-MX" w:eastAsia="es-MX"/>
+          <w14:ligatures w14:val="none"/>
+        </w:rPr>
+      </w:pPr>
+      <w:r>
+        <w:rPr>
+          <w:rFonts w:ascii="Arial" w:eastAsia="Times New Roman" w:hAnsi="Arial" w:cs="Arial"/>
+          <w:color w:val="091C85"/>
+          <w:kern w:val="0"/>
+          <w:lang w:val="es-MX" w:eastAsia="es-MX"/>
+          <w14:ligatures w14:val="none"/>
+        </w:rPr>
+        <w:t>La organización por categorías permite recorrer el trabajo de manera clara. En index.html, las categorías se muestran mediante una galería horizontal y su contenido se genera dinámicamente a partir de assets/portfolio-data.js.</w:t>
+      </w:r>
+    </w:p>
+    <w:p>
+      <w:pPr>
+        <w:spacing w:before="100" w:beforeAutospacing="1" w:after="100" w:afterAutospacing="1"/>
+        <w:rPr>
+          <w:rFonts w:ascii="Arial" w:eastAsia="Times New Roman" w:hAnsi="Arial" w:cs="Arial"/>
+          <w:color w:val="091C85"/>
+          <w:kern w:val="0"/>
+          <w:lang w:val="es-MX" w:eastAsia="es-MX"/>
+          <w14:ligatures w14:val="none"/>
+        </w:rPr>
+      </w:pPr>
+      <w:r>
+        <w:rPr>
+          <w:rFonts w:ascii="Arial" w:eastAsia="Times New Roman" w:hAnsi="Arial" w:cs="Arial"/>
+          <w:color w:val="091C85"/>
+          <w:kern w:val="0"/>
+          <w:lang w:val="es-MX" w:eastAsia="es-MX"/>
+          <w14:ligatures w14:val="none"/>
+        </w:rPr>
+        <w:t>Las imágenes de los proyectos se presentan en las vistas de categoría y detalle. El HTML define sus proporciones y tratamientos mediante estilos específicos; los archivos visuales se cargan desde las rutas declaradas en los datos de cada proyecto.</w:t>
       </w:r>
     </w:p>
     <w:p>
@@ -1300,51 +1310,51 @@
           <w:lang w:val="es-MX" w:eastAsia="es-MX"/>
           <w14:ligatures w14:val="none"/>
         </w:rPr>
-        <w:t>Cada proyecto estará acompañado por información breve:</w:t>
-      </w:r>
-    </w:p>
-    <w:p>
-      <w:pPr>
-        <w:spacing w:before="100" w:beforeAutospacing="1" w:after="100" w:afterAutospacing="1"/>
-        <w:rPr>
-          <w:rFonts w:ascii="Arial" w:eastAsia="Times New Roman" w:hAnsi="Arial" w:cs="Arial"/>
-          <w:color w:val="091C85"/>
-          <w:kern w:val="0"/>
-          <w:lang w:val="es-MX" w:eastAsia="es-MX"/>
-          <w14:ligatures w14:val="none"/>
-        </w:rPr>
-      </w:pPr>
-      <w:r>
-        <w:rPr>
-          <w:rFonts w:ascii="Arial" w:eastAsia="Times New Roman" w:hAnsi="Arial" w:cs="Arial"/>
-          <w:color w:val="091C85"/>
-          <w:kern w:val="0"/>
-          <w:lang w:val="es-MX" w:eastAsia="es-MX"/>
-          <w14:ligatures w14:val="none"/>
-        </w:rPr>
-        <w:t>Nombre del proyecto · Categoría · Año · Descripción breve</w:t>
-      </w:r>
-    </w:p>
-    <w:p>
-      <w:pPr>
-        <w:spacing w:before="100" w:beforeAutospacing="1" w:after="100" w:afterAutospacing="1"/>
-        <w:rPr>
-          <w:rFonts w:ascii="Arial" w:eastAsia="Times New Roman" w:hAnsi="Arial" w:cs="Arial"/>
-          <w:color w:val="091C85"/>
-          <w:kern w:val="0"/>
-          <w:lang w:val="es-MX" w:eastAsia="es-MX"/>
-          <w14:ligatures w14:val="none"/>
-        </w:rPr>
-      </w:pPr>
-      <w:r>
-        <w:rPr>
-          <w:rFonts w:ascii="Arial" w:eastAsia="Times New Roman" w:hAnsi="Arial" w:cs="Arial"/>
-          <w:color w:val="091C85"/>
-          <w:kern w:val="0"/>
-          <w:lang w:val="es-MX" w:eastAsia="es-MX"/>
-          <w14:ligatures w14:val="none"/>
-        </w:rPr>
-        <w:t>La intención es que el texto sirva como contexto y que la imagen sea el principal punto de atención.</w:t>
+        <w:t>Cada proyecto puede incluir la siguiente información, según los datos disponibles:</w:t>
+      </w:r>
+    </w:p>
+    <w:p>
+      <w:pPr>
+        <w:spacing w:before="100" w:beforeAutospacing="1" w:after="100" w:afterAutospacing="1"/>
+        <w:rPr>
+          <w:rFonts w:ascii="Arial" w:eastAsia="Times New Roman" w:hAnsi="Arial" w:cs="Arial"/>
+          <w:color w:val="091C85"/>
+          <w:kern w:val="0"/>
+          <w:lang w:val="es-MX" w:eastAsia="es-MX"/>
+          <w14:ligatures w14:val="none"/>
+        </w:rPr>
+      </w:pPr>
+      <w:r>
+        <w:rPr>
+          <w:rFonts w:ascii="Arial" w:eastAsia="Times New Roman" w:hAnsi="Arial" w:cs="Arial"/>
+          <w:color w:val="091C85"/>
+          <w:kern w:val="0"/>
+          <w:lang w:val="es-MX" w:eastAsia="es-MX"/>
+          <w14:ligatures w14:val="none"/>
+        </w:rPr>
+        <w:t>Nombre del proyecto · Categoría · Descripción breve e imágenes o videos</w:t>
+      </w:r>
+    </w:p>
+    <w:p>
+      <w:pPr>
+        <w:spacing w:before="100" w:beforeAutospacing="1" w:after="100" w:afterAutospacing="1"/>
+        <w:rPr>
+          <w:rFonts w:ascii="Arial" w:eastAsia="Times New Roman" w:hAnsi="Arial" w:cs="Arial"/>
+          <w:color w:val="091C85"/>
+          <w:kern w:val="0"/>
+          <w:lang w:val="es-MX" w:eastAsia="es-MX"/>
+          <w14:ligatures w14:val="none"/>
+        </w:rPr>
+      </w:pPr>
+      <w:r>
+        <w:rPr>
+          <w:rFonts w:ascii="Arial" w:eastAsia="Times New Roman" w:hAnsi="Arial" w:cs="Arial"/>
+          <w:color w:val="091C85"/>
+          <w:kern w:val="0"/>
+          <w:lang w:val="es-MX" w:eastAsia="es-MX"/>
+          <w14:ligatures w14:val="none"/>
+        </w:rPr>
+        <w:t>La información escrita aporta contexto y las imágenes o videos muestran el resultado visual. El año no se presenta como un dato obligatorio en la estructura actual.</w:t>
       </w:r>
     </w:p>
     <w:p>
@@ -1442,7 +1452,7 @@
           <w:lang w:val="es-MX" w:eastAsia="es-MX"/>
           <w14:ligatures w14:val="none"/>
         </w:rPr>
-        <w:t>Navegación</w:t>
+        <w:t>La navegación conecta las seis secciones de la landing: Sobre mí, Educación, Proyectos, Habilidades, Herramientas y Contacto. En la portada también aparecen los accesos “MIS PROYECTOS” y “CONTACTO”.</w:t>
       </w:r>
     </w:p>
     <w:p>
@@ -1486,7 +1496,17 @@
           <w:lang w:val="es-MX" w:eastAsia="es-MX"/>
           <w14:ligatures w14:val="none"/>
         </w:rPr>
-        <w:t>Las secciones estarán organizadas de la siguiente manera:</w:t>
+        <w:t>Sobre mí</w:t>
+        <w:br/>
+        <w:t>Educación</w:t>
+        <w:br/>
+        <w:t>Proyectos</w:t>
+        <w:br/>
+        <w:t>Habilidades</w:t>
+        <w:br/>
+        <w:t>Herramientas</w:t>
+        <w:br/>
+        <w:t>Contacto</w:t>
       </w:r>
     </w:p>
     <w:p>
@@ -1612,74 +1632,73 @@
           <w:lang w:val="es-MX" w:eastAsia="es-MX"/>
           <w14:ligatures w14:val="none"/>
         </w:rPr>
-        <w:t>Botones</w:t>
-      </w:r>
-    </w:p>
-    <w:p>
-      <w:pPr>
-        <w:spacing w:before="100" w:beforeAutospacing="1" w:after="100" w:afterAutospacing="1"/>
-        <w:rPr>
-          <w:rFonts w:ascii="Arial" w:eastAsia="Times New Roman" w:hAnsi="Arial" w:cs="Arial"/>
-          <w:color w:val="091C85"/>
-          <w:kern w:val="0"/>
-          <w:lang w:val="es-MX" w:eastAsia="es-MX"/>
-          <w14:ligatures w14:val="none"/>
-        </w:rPr>
-      </w:pPr>
-      <w:r>
-        <w:rPr>
-          <w:rFonts w:ascii="Arial" w:eastAsia="Times New Roman" w:hAnsi="Arial" w:cs="Arial"/>
-          <w:color w:val="091C85"/>
-          <w:kern w:val="0"/>
-          <w:lang w:val="es-MX" w:eastAsia="es-MX"/>
-          <w14:ligatures w14:val="none"/>
-        </w:rPr>
-        <w:t>Los botones utilizan una forma de cápsula, diferenciándose de las tarjetas y otros contenedores.</w:t>
-      </w:r>
-    </w:p>
-    <w:p>
-      <w:pPr>
-        <w:spacing w:before="100" w:beforeAutospacing="1" w:after="100" w:afterAutospacing="1"/>
-        <w:rPr>
-          <w:rFonts w:ascii="Arial" w:eastAsia="Times New Roman" w:hAnsi="Arial" w:cs="Arial"/>
-          <w:color w:val="091C85"/>
-          <w:kern w:val="0"/>
-          <w:lang w:val="es-MX" w:eastAsia="es-MX"/>
-          <w14:ligatures w14:val="none"/>
-        </w:rPr>
-      </w:pPr>
-      <w:r>
-        <w:rPr>
-          <w:rFonts w:ascii="Arial" w:eastAsia="Times New Roman" w:hAnsi="Arial" w:cs="Arial"/>
-          <w:color w:val="091C85"/>
-          <w:kern w:val="0"/>
-          <w:lang w:val="es-MX" w:eastAsia="es-MX"/>
-          <w14:ligatures w14:val="none"/>
-        </w:rPr>
-        <w:lastRenderedPageBreak/>
-        <w:t>La forma redondeada busca reforzar la personalidad cercana y amigable de la identidad. Los colores principales utilizados son el azul y el beige.</w:t>
-      </w:r>
-    </w:p>
-    <w:p>
-      <w:pPr>
-        <w:spacing w:before="100" w:beforeAutospacing="1" w:after="100" w:afterAutospacing="1"/>
-        <w:rPr>
-          <w:rFonts w:ascii="Arial" w:eastAsia="Times New Roman" w:hAnsi="Arial" w:cs="Arial"/>
-          <w:color w:val="091C85"/>
-          <w:kern w:val="0"/>
-          <w:lang w:val="es-MX" w:eastAsia="es-MX"/>
-          <w14:ligatures w14:val="none"/>
-        </w:rPr>
-      </w:pPr>
-      <w:r>
-        <w:rPr>
-          <w:rFonts w:ascii="Arial" w:eastAsia="Times New Roman" w:hAnsi="Arial" w:cs="Arial"/>
-          <w:color w:val="091C85"/>
-          <w:kern w:val="0"/>
-          <w:lang w:val="es-MX" w:eastAsia="es-MX"/>
-          <w14:ligatures w14:val="none"/>
-        </w:rPr>
-        <w:t>En estados de interacción, los botones pueden cambiar de color y mostrar un pequeño detalle gráfico, como una línea, una flecha o una textura.</w:t>
+        <w:t>Los botones principales de la portada tienen esquinas redondeadas, con un radio de 16 px en la implementación actual; no utilizan la forma de cápsula completa.</w:t>
+      </w:r>
+    </w:p>
+    <w:p>
+      <w:pPr>
+        <w:spacing w:before="100" w:beforeAutospacing="1" w:after="100" w:afterAutospacing="1"/>
+        <w:rPr>
+          <w:rFonts w:ascii="Arial" w:eastAsia="Times New Roman" w:hAnsi="Arial" w:cs="Arial"/>
+          <w:color w:val="091C85"/>
+          <w:kern w:val="0"/>
+          <w:lang w:val="es-MX" w:eastAsia="es-MX"/>
+          <w14:ligatures w14:val="none"/>
+        </w:rPr>
+      </w:pPr>
+      <w:r>
+        <w:rPr>
+          <w:rFonts w:ascii="Arial" w:eastAsia="Times New Roman" w:hAnsi="Arial" w:cs="Arial"/>
+          <w:color w:val="091C85"/>
+          <w:kern w:val="0"/>
+          <w:lang w:val="es-MX" w:eastAsia="es-MX"/>
+          <w14:ligatures w14:val="none"/>
+        </w:rPr>
+        <w:t>La forma redondeada refuerza una personalidad cercana y amigable. Los colores principales utilizados son el azul #113051 y el beige #F9F7EF.</w:t>
+      </w:r>
+    </w:p>
+    <w:p>
+      <w:pPr>
+        <w:spacing w:before="100" w:beforeAutospacing="1" w:after="100" w:afterAutospacing="1"/>
+        <w:rPr>
+          <w:rFonts w:ascii="Arial" w:eastAsia="Times New Roman" w:hAnsi="Arial" w:cs="Arial"/>
+          <w:color w:val="091C85"/>
+          <w:kern w:val="0"/>
+          <w:lang w:val="es-MX" w:eastAsia="es-MX"/>
+          <w14:ligatures w14:val="none"/>
+        </w:rPr>
+      </w:pPr>
+      <w:r>
+        <w:rPr>
+          <w:rFonts w:ascii="Arial" w:eastAsia="Times New Roman" w:hAnsi="Arial" w:cs="Arial"/>
+          <w:color w:val="091C85"/>
+          <w:kern w:val="0"/>
+          <w:lang w:val="es-MX" w:eastAsia="es-MX"/>
+          <w14:ligatures w14:val="none"/>
+        </w:rPr>
+        <w:t>Los estados de interacción se resuelven mediante los estilos y transiciones definidos en el HTML, manteniendo el contraste y la legibilidad.</w:t>
+      </w:r>
+    </w:p>
+    <w:p>
+      <w:pPr>
+        <w:spacing w:before="100" w:beforeAutospacing="1" w:after="100" w:afterAutospacing="1"/>
+        <w:rPr>
+          <w:rFonts w:ascii="Arial" w:eastAsia="Times New Roman" w:hAnsi="Arial" w:cs="Arial"/>
+          <w:color w:val="091C85"/>
+          <w:kern w:val="0"/>
+          <w:lang w:val="es-MX" w:eastAsia="es-MX"/>
+          <w14:ligatures w14:val="none"/>
+        </w:rPr>
+      </w:pPr>
+      <w:r>
+        <w:rPr>
+          <w:rFonts w:ascii="Arial" w:eastAsia="Times New Roman" w:hAnsi="Arial" w:cs="Arial"/>
+          <w:color w:val="091C85"/>
+          <w:kern w:val="0"/>
+          <w:lang w:val="es-MX" w:eastAsia="es-MX"/>
+          <w14:ligatures w14:val="none"/>
+        </w:rPr>
+        <w:t>La interacción busca acompañar la navegación sin sobrecargar la experiencia. La página también incluye una introducción animada del logotipo mediante recursos de video.</w:t>
       </w:r>
     </w:p>
     <w:p>
@@ -3119,7 +3138,7 @@
           <w:lang w:val="es-MX" w:eastAsia="es-MX"/>
           <w14:ligatures w14:val="none"/>
         </w:rPr>
-        <w:t>La información de educación se mantiene sencilla y directa. Presento únicamente mi universidad y carrera, sin agregar cursos o certificaciones adicionales.</w:t>
+        <w:t>La información de educación se mantendrá sencilla y directa, presentando únicamente mi universidad y carrera. Esta sección forma parte de la estructura prevista del CV, pero no está desarrollada como contenido en la página HTML de referencia.</w:t>
       </w:r>
     </w:p>
     <w:p>
@@ -3180,7 +3199,7 @@
           <w:lang w:val="es-MX" w:eastAsia="es-MX"/>
           <w14:ligatures w14:val="none"/>
         </w:rPr>
-        <w:t>Los proyectos representan la parte más visual del CV y se organizan en las cuatro categorías previamente definidas.</w:t>
+        <w:t>Los proyectos representan la parte más visual del CV y se organizarán en las cuatro categorías previamente definidas. En la página HTML actual se incluye solo una tarjeta de proyecto de ejemplo, por lo que aún falta incorporar las categorías y los proyectos reales.</w:t>
       </w:r>
     </w:p>
     <w:p>
@@ -3263,7 +3282,7 @@
           <w:lang w:val="es-MX" w:eastAsia="es-MX"/>
           <w14:ligatures w14:val="none"/>
         </w:rPr>
-        <w:t>La sección final reúne mis principales medios de contacto:</w:t>
+        <w:t>La sección de contacto reúne los medios visibles en la página:</w:t>
       </w:r>
     </w:p>
     <w:p>
@@ -3289,7 +3308,7 @@
           <w:lang w:val="es-MX" w:eastAsia="es-MX"/>
           <w14:ligatures w14:val="none"/>
         </w:rPr>
-        <w:t>Correo electrónico.</w:t>
+        <w:t>Teléfono.</w:t>
       </w:r>
     </w:p>
     <w:p>
@@ -3315,7 +3334,7 @@
           <w:lang w:val="es-MX" w:eastAsia="es-MX"/>
           <w14:ligatures w14:val="none"/>
         </w:rPr>
-        <w:t>Instagram.</w:t>
+        <w:t>Correo electrónico.</w:t>
       </w:r>
     </w:p>
     <w:p>
@@ -3341,7 +3360,7 @@
           <w:lang w:val="es-MX" w:eastAsia="es-MX"/>
           <w14:ligatures w14:val="none"/>
         </w:rPr>
-        <w:t>LinkedIn.</w:t>
+        <w:t>Instagram.</w:t>
       </w:r>
     </w:p>
     <w:p>
@@ -3393,7 +3412,7 @@
           <w:lang w:val="es-MX" w:eastAsia="es-MX"/>
           <w14:ligatures w14:val="none"/>
         </w:rPr>
-        <w:t>Teléfono.</w:t>
+        <w:t>No se incluye LinkedIn en la sección de contacto actual.</w:t>
       </w:r>
     </w:p>
     <w:p>
@@ -3419,29 +3438,29 @@
           <w:lang w:val="es-MX" w:eastAsia="es-MX"/>
           <w14:ligatures w14:val="none"/>
         </w:rPr>
-        <w:t>Otros medios profesionales cuando sea necesario.</w:t>
-      </w:r>
-    </w:p>
-    <w:p>
-      <w:pPr>
-        <w:spacing w:before="100" w:beforeAutospacing="1" w:after="100" w:afterAutospacing="1"/>
-        <w:rPr>
-          <w:rFonts w:ascii="Arial" w:eastAsia="Times New Roman" w:hAnsi="Arial" w:cs="Arial"/>
-          <w:color w:val="091C85"/>
-          <w:kern w:val="0"/>
-          <w:lang w:val="es-MX" w:eastAsia="es-MX"/>
-          <w14:ligatures w14:val="none"/>
-        </w:rPr>
-      </w:pPr>
-      <w:r>
-        <w:rPr>
-          <w:rFonts w:ascii="Arial" w:eastAsia="Times New Roman" w:hAnsi="Arial" w:cs="Arial"/>
-          <w:color w:val="091C85"/>
-          <w:kern w:val="0"/>
-          <w:lang w:val="es-MX" w:eastAsia="es-MX"/>
-          <w14:ligatures w14:val="none"/>
-        </w:rPr>
-        <w:t>Los medios se presentan mediante pequeñas tarjetas con ícono + nombre, siguiendo el mismo lenguaje de marcos y esquinas redondeadas utilizado en otras partes del sistema.</w:t>
+        <w:t>Los datos y enlaces se presentan como accesos directos para facilitar la comunicación.</w:t>
+      </w:r>
+    </w:p>
+    <w:p>
+      <w:pPr>
+        <w:spacing w:before="100" w:beforeAutospacing="1" w:after="100" w:afterAutospacing="1"/>
+        <w:rPr>
+          <w:rFonts w:ascii="Arial" w:eastAsia="Times New Roman" w:hAnsi="Arial" w:cs="Arial"/>
+          <w:color w:val="091C85"/>
+          <w:kern w:val="0"/>
+          <w:lang w:val="es-MX" w:eastAsia="es-MX"/>
+          <w14:ligatures w14:val="none"/>
+        </w:rPr>
+      </w:pPr>
+      <w:r>
+        <w:rPr>
+          <w:rFonts w:ascii="Arial" w:eastAsia="Times New Roman" w:hAnsi="Arial" w:cs="Arial"/>
+          <w:color w:val="091C85"/>
+          <w:kern w:val="0"/>
+          <w:lang w:val="es-MX" w:eastAsia="es-MX"/>
+          <w14:ligatures w14:val="none"/>
+        </w:rPr>
+        <w:t>La página actual muestra teléfono, correo electrónico, Instagram y Behance. El pie de página incluye el nombre y la leyenda de derechos reservados, sin enlaces a redes sociales.</w:t>
       </w:r>
     </w:p>
     <w:p>
@@ -3556,7 +3575,7 @@
           <w:lang w:val="es-MX" w:eastAsia="es-MX"/>
           <w14:ligatures w14:val="none"/>
         </w:rPr>
-        <w:t>Los elementos que siempre deben permanecer reconocibles son:</w:t>
+        <w:t>Los elementos que deben permanecer reconocibles en la página de referencia son:</w:t>
       </w:r>
     </w:p>
     <w:p>
@@ -3608,8 +3627,7 @@
           <w:lang w:val="es-MX" w:eastAsia="es-MX"/>
           <w14:ligatures w14:val="none"/>
         </w:rPr>
-        <w:lastRenderedPageBreak/>
-        <w:t>El beige #FEFAE7.</w:t>
+        <w:t>El beige #F9F7EF.</w:t>
       </w:r>
     </w:p>
     <w:p>
@@ -3635,7 +3653,7 @@
           <w:lang w:val="es-MX" w:eastAsia="es-MX"/>
           <w14:ligatures w14:val="none"/>
         </w:rPr>
-        <w:t>Handsome Pro.</w:t>
+        <w:t>Handsome Pro como primera opción display; Playwrite US Trad cargada localmente como alternativa y utilizada en títulos de sección.</w:t>
       </w:r>
     </w:p>
     <w:p>
@@ -3661,7 +3679,7 @@
           <w:lang w:val="es-MX" w:eastAsia="es-MX"/>
           <w14:ligatures w14:val="none"/>
         </w:rPr>
-        <w:t>Raleway.</w:t>
+        <w:t>Manrope para textos funcionales e interfaz.</w:t>
       </w:r>
     </w:p>
     <w:p>
@@ -3884,29 +3902,29 @@
           <w:lang w:val="es-MX" w:eastAsia="es-MX"/>
           <w14:ligatures w14:val="none"/>
         </w:rPr>
-        <w:t>Mi paleta se mantiene centrada en el azul #113051 y el beige #FEFAE7. No necesito incorporar una gran cantidad de colores para generar variedad, ya que la diversidad visual se consigue mediante composición, imágenes, textura y escala.</w:t>
-      </w:r>
-    </w:p>
-    <w:p>
-      <w:pPr>
-        <w:spacing w:before="100" w:beforeAutospacing="1" w:after="100" w:afterAutospacing="1"/>
-        <w:rPr>
-          <w:rFonts w:ascii="Arial" w:eastAsia="Times New Roman" w:hAnsi="Arial" w:cs="Arial"/>
-          <w:color w:val="091C85"/>
-          <w:kern w:val="0"/>
-          <w:lang w:val="es-MX" w:eastAsia="es-MX"/>
-          <w14:ligatures w14:val="none"/>
-        </w:rPr>
-      </w:pPr>
-      <w:r>
-        <w:rPr>
-          <w:rFonts w:ascii="Arial" w:eastAsia="Times New Roman" w:hAnsi="Arial" w:cs="Arial"/>
-          <w:color w:val="091C85"/>
-          <w:kern w:val="0"/>
-          <w:lang w:val="es-MX" w:eastAsia="es-MX"/>
-          <w14:ligatures w14:val="none"/>
-        </w:rPr>
-        <w:t>Handsome Pro debe mantenerse como una tipografía expresiva y puntual. No debe utilizarse en textos largos ni competir con Raleway.</w:t>
+        <w:t>Mi paleta se mantiene centrada en el azul #113051 y el beige #F9F7EF. No necesito incorporar una gran cantidad de colores para generar variedad, ya que la diversidad visual se consigue mediante composición, imágenes, textura y escala.</w:t>
+      </w:r>
+    </w:p>
+    <w:p>
+      <w:pPr>
+        <w:spacing w:before="100" w:beforeAutospacing="1" w:after="100" w:afterAutospacing="1"/>
+        <w:rPr>
+          <w:rFonts w:ascii="Arial" w:eastAsia="Times New Roman" w:hAnsi="Arial" w:cs="Arial"/>
+          <w:color w:val="091C85"/>
+          <w:kern w:val="0"/>
+          <w:lang w:val="es-MX" w:eastAsia="es-MX"/>
+          <w14:ligatures w14:val="none"/>
+        </w:rPr>
+      </w:pPr>
+      <w:r>
+        <w:rPr>
+          <w:rFonts w:ascii="Arial" w:eastAsia="Times New Roman" w:hAnsi="Arial" w:cs="Arial"/>
+          <w:color w:val="091C85"/>
+          <w:kern w:val="0"/>
+          <w:lang w:val="es-MX" w:eastAsia="es-MX"/>
+          <w14:ligatures w14:val="none"/>
+        </w:rPr>
+        <w:t>Handsome Pro se declara como primera opción display. Playwrite US Trad está cargada localmente, funciona como alternativa en la pila display y se utiliza en títulos de sección. Manrope es la tipografía funcional de la interfaz.</w:t>
       </w:r>
     </w:p>
     <w:p>
@@ -4083,52 +4101,51 @@
           <w:lang w:val="es-MX" w:eastAsia="es-MX"/>
           <w14:ligatures w14:val="none"/>
         </w:rPr>
-        <w:lastRenderedPageBreak/>
-        <w:t>Mi sistema de diseño busca construir una identidad que funcione como una extensión de mi propia manera de diseñar. Parte de una firma personal y combina una estructura ordenada con elementos gráficos más expresivos.</w:t>
-      </w:r>
-    </w:p>
-    <w:p>
-      <w:pPr>
-        <w:spacing w:before="100" w:beforeAutospacing="1" w:after="100" w:afterAutospacing="1"/>
-        <w:rPr>
-          <w:rFonts w:ascii="Arial" w:eastAsia="Times New Roman" w:hAnsi="Arial" w:cs="Arial"/>
-          <w:color w:val="091C85"/>
-          <w:kern w:val="0"/>
-          <w:lang w:val="es-MX" w:eastAsia="es-MX"/>
-          <w14:ligatures w14:val="none"/>
-        </w:rPr>
-      </w:pPr>
-      <w:r>
-        <w:rPr>
-          <w:rFonts w:ascii="Arial" w:eastAsia="Times New Roman" w:hAnsi="Arial" w:cs="Arial"/>
-          <w:color w:val="091C85"/>
-          <w:kern w:val="0"/>
-          <w:lang w:val="es-MX" w:eastAsia="es-MX"/>
-          <w14:ligatures w14:val="none"/>
-        </w:rPr>
-        <w:t>El azul y el beige establecen la base visual; Handsome Pro y Raleway construyen la voz tipográfica; la retícula aporta estructura; y las texturas, líneas, marcos, números y elementos de collage introducen personalidad.</w:t>
-      </w:r>
-    </w:p>
-    <w:p>
-      <w:pPr>
-        <w:spacing w:before="100" w:beforeAutospacing="1" w:after="100" w:afterAutospacing="1"/>
-        <w:rPr>
-          <w:rFonts w:ascii="Arial" w:eastAsia="Times New Roman" w:hAnsi="Arial" w:cs="Arial"/>
-          <w:color w:val="091C85"/>
-          <w:kern w:val="0"/>
-          <w:lang w:val="es-MX" w:eastAsia="es-MX"/>
-          <w14:ligatures w14:val="none"/>
-        </w:rPr>
-      </w:pPr>
-      <w:r>
-        <w:rPr>
-          <w:rFonts w:ascii="Arial" w:eastAsia="Times New Roman" w:hAnsi="Arial" w:cs="Arial"/>
-          <w:color w:val="091C85"/>
-          <w:kern w:val="0"/>
-          <w:lang w:val="es-MX" w:eastAsia="es-MX"/>
-          <w14:ligatures w14:val="none"/>
-        </w:rPr>
-        <w:t>El resultado que busco es un CV que no se sienta como una plantilla, sino como una representación visual de mí como diseñadora: creativa, profesional, moderna, divertida, cercana y con una identidad propia.</w:t>
+        <w:t>Mi sistema de diseño busca construir una identidad que funcione como una extensión de mi manera de diseñar. El index.html aplica la paleta, la tipografía, el espaciado, las formas, las sombras y los componentes descritos aquí.</w:t>
+      </w:r>
+    </w:p>
+    <w:p>
+      <w:pPr>
+        <w:spacing w:before="100" w:beforeAutospacing="1" w:after="100" w:afterAutospacing="1"/>
+        <w:rPr>
+          <w:rFonts w:ascii="Arial" w:eastAsia="Times New Roman" w:hAnsi="Arial" w:cs="Arial"/>
+          <w:color w:val="091C85"/>
+          <w:kern w:val="0"/>
+          <w:lang w:val="es-MX" w:eastAsia="es-MX"/>
+          <w14:ligatures w14:val="none"/>
+        </w:rPr>
+      </w:pPr>
+      <w:r>
+        <w:rPr>
+          <w:rFonts w:ascii="Arial" w:eastAsia="Times New Roman" w:hAnsi="Arial" w:cs="Arial"/>
+          <w:color w:val="091C85"/>
+          <w:kern w:val="0"/>
+          <w:lang w:val="es-MX" w:eastAsia="es-MX"/>
+          <w14:ligatures w14:val="none"/>
+        </w:rPr>
+        <w:t>El azul #113051 y el beige #F9F7EF establecen la base visual; Handsome Pro, Playwrite US Trad y Manrope construyen la voz tipográfica. La estructura, las imágenes de los proyectos y los componentes de interacción completan el sistema visual.</w:t>
+      </w:r>
+    </w:p>
+    <w:p>
+      <w:pPr>
+        <w:spacing w:before="100" w:beforeAutospacing="1" w:after="100" w:afterAutospacing="1"/>
+        <w:rPr>
+          <w:rFonts w:ascii="Arial" w:eastAsia="Times New Roman" w:hAnsi="Arial" w:cs="Arial"/>
+          <w:color w:val="091C85"/>
+          <w:kern w:val="0"/>
+          <w:lang w:val="es-MX" w:eastAsia="es-MX"/>
+          <w14:ligatures w14:val="none"/>
+        </w:rPr>
+      </w:pPr>
+      <w:r>
+        <w:rPr>
+          <w:rFonts w:ascii="Arial" w:eastAsia="Times New Roman" w:hAnsi="Arial" w:cs="Arial"/>
+          <w:color w:val="091C85"/>
+          <w:kern w:val="0"/>
+          <w:lang w:val="es-MX" w:eastAsia="es-MX"/>
+          <w14:ligatures w14:val="none"/>
+        </w:rPr>
+        <w:t>El resultado que busco es un CV digital que no se sienta como una plantilla, sino como una representación visual de mí como diseñadora: creativa, profesional, moderna, divertida, cercana y con una identidad propia. La página de referencia establece las reglas visuales que deben mantenerse al desarrollar el contenido completo.</w:t>
       </w:r>
     </w:p>
     <w:p>

</xml_diff>